<commit_message>
upload Word for devarim
</commit_message>
<xml_diff>
--- a/public/data/bulletins/5786/devarim.docx
+++ b/public/data/bulletins/5786/devarim.docx
@@ -155,14 +155,28 @@
           <w:rFonts w:hint="cs"/>
           <w:rtl/>
         </w:rPr>
-        <w:t xml:space="preserve"> לפני מותו</w:t>
-      </w:r>
-      <w:r>
-        <w:rPr>
-          <w:rFonts w:hint="cs"/>
-          <w:rtl/>
-        </w:rPr>
-        <w:t xml:space="preserve"> לעם ישראל על ההתנהלות שלו איתם</w:t>
+        <w:t xml:space="preserve"> </w:t>
+      </w:r>
+      <w:r>
+        <w:rPr>
+          <w:rFonts w:hint="cs"/>
+          <w:rtl/>
+        </w:rPr>
+        <w:t xml:space="preserve">לעם ישראל </w:t>
+      </w:r>
+      <w:r>
+        <w:rPr>
+          <w:rFonts w:hint="cs"/>
+          <w:rtl/>
+        </w:rPr>
+        <w:t xml:space="preserve">לפני מותו </w:t>
+      </w:r>
+      <w:r>
+        <w:rPr>
+          <w:rFonts w:hint="cs"/>
+          <w:rtl/>
+        </w:rPr>
+        <w:t>על ההתנהלות שלו איתם</w:t>
       </w:r>
       <w:r>
         <w:rPr>
@@ -1191,7 +1205,21 @@
           <w:rFonts w:hint="cs"/>
           <w:rtl/>
         </w:rPr>
-        <w:t>ישנו זוג, בעל ואשה, שאופן כללי מאוד נחמדים ונעימים אחד לשני. הם אוהבים את אחד השני באמת, ובסך הכל חיים בטוב. אולם, קורה לפעמים שאחד מבני הזוג פוגע בשני וגורם לו כאב וצער. לאחר מעשה, כאשר הפוגע חושב על מה שקרה, הוא לא מצליח להבין: מדוע עשיתי כך? אני הרי ממש לא רוצה להכאיב או לפגוע, ואנחנו גם אוהבים וכיף לנו ביחד. מדוע שוב פגעתי?</w:t>
+        <w:t>ישנו זוג, בעל ואשה, ש</w:t>
+      </w:r>
+      <w:r>
+        <w:rPr>
+          <w:rFonts w:hint="cs"/>
+          <w:rtl/>
+        </w:rPr>
+        <w:t>ב</w:t>
+      </w:r>
+      <w:r>
+        <w:rPr>
+          <w:rFonts w:hint="cs"/>
+          <w:rtl/>
+        </w:rPr>
+        <w:t>אופן כללי מאוד נחמדים ונעימים אחד לשני. הם אוהבים את אחד השני באמת, ובסך הכל חיים בטוב. אולם, קורה לפעמים שאחד מבני הזוג פוגע בשני וגורם לו כאב וצער. לאחר מעשה, כאשר הפוגע חושב על מה שקרה, הוא לא מצליח להבין: מדוע עשיתי כך? אני הרי ממש לא רוצה להכאיב או לפגוע, ואנחנו גם אוהבים וכיף לנו ביחד. מדוע שוב פגעתי?</w:t>
       </w:r>
     </w:p>
     <w:p>
@@ -1212,14 +1240,28 @@
           <w:rFonts w:hint="cs"/>
           <w:rtl/>
         </w:rPr>
-        <w:t>באה לי בספונטניות</w:t>
-      </w:r>
-      <w:r>
-        <w:rPr>
-          <w:rFonts w:hint="cs"/>
-          <w:rtl/>
-        </w:rPr>
-        <w:t xml:space="preserve">. המקום בו השכל לא שולט. אכן בשכל הם מאוד מחוברים, אבל במקום העליון יותר מהשכל  - הם עוד צריכים להשתפר. </w:t>
+        <w:t>באה בספונטניות</w:t>
+      </w:r>
+      <w:r>
+        <w:rPr>
+          <w:rFonts w:hint="cs"/>
+          <w:rtl/>
+        </w:rPr>
+        <w:t xml:space="preserve">. </w:t>
+      </w:r>
+      <w:r>
+        <w:rPr>
+          <w:rFonts w:hint="cs"/>
+          <w:rtl/>
+        </w:rPr>
+        <w:t>מ</w:t>
+      </w:r>
+      <w:r>
+        <w:rPr>
+          <w:rFonts w:hint="cs"/>
+          <w:rtl/>
+        </w:rPr>
+        <w:t xml:space="preserve">המקום בו השכל לא שולט. אכן בשכל הם מאוד מחוברים, אבל במקום העליון יותר מהשכל  - הם עוד צריכים להשתפר. </w:t>
       </w:r>
       <w:r>
         <w:rPr>

</xml_diff>